<commit_message>
Regenerate deliverable PDFs and SRS 1.5 conformance appendix
Co-Authored-By: Claude Opus 5.5 <noreply@anthropic.com>
Claude-Session: https://claude.ai/code/session_018jWCkFayhGXSEUDh9BTEcJ
</commit_message>
<xml_diff>
--- a/DynamicMS/deliverables/DynamicCortex_Apps_Standard_SRS_v1_5.docx
+++ b/DynamicMS/deliverables/DynamicCortex_Apps_Standard_SRS_v1_5.docx
@@ -30938,7 +30938,7 @@
                 <w:szCs w:val="19"/>
                 <w:lang w:val="en-US"/>
               </w:rPr>
-              <w:t xml:space="preserve">DynamicMS offers search inside individual screens (Help, registers, rules, documents) but no global search yet: Not met.</w:t>
+              <w:t xml:space="preserve">Search button at the top of the menu and Ctrl+K; steps, macro processes, records, register entries, documents, AI Use Cases, people and Help, grouped by type with filters, within the user's rights; menu filter: Met.</w:t>
             </w:r>
           </w:p>
         </w:tc>
@@ -31018,7 +31018,7 @@
                 <w:szCs w:val="19"/>
                 <w:lang w:val="en-US"/>
               </w:rPr>
-              <w:t xml:space="preserve">DynamicMS versions steps and BPMN diagrams and gives full CRUD on templates; CRUD and restore on functions, macro processes, tasks, gates and checklists with Design Releases are not yet available: Partial.</w:t>
+              <w:t xml:space="preserve">Process design editor with create, read, update, retire or delete and restore on functions, phases, macro processes, tasks, steps, gates and checklists (templates in the document library); every save is a version with compare and restore; usage shown before a change; running projects keep the version they started with. Named Design Releases and import or export of the design are not yet available: Partial (core met).</w:t>
             </w:r>
           </w:p>
         </w:tc>
@@ -31104,7 +31104,7 @@
                 <w:szCs w:val="19"/>
                 <w:lang w:val="en-US"/>
               </w:rPr>
-              <w:t xml:space="preserve">DynamicMS holds OBS units and people with a role in each unit and OBS pickers in step forms; functions and dated Role Assignments are not yet modeled: Partial.</w:t>
+              <w:t xml:space="preserve">OBS roles defined in units and linked to one or more functions; people assigned as holder, deputy or acting with allocation and dates; views by role, by function and by person; vacant roles flagged; hand-over of open work when an assignment ends; roles versioned and separate from access roles: Met.</w:t>
             </w:r>
           </w:p>
         </w:tc>
@@ -31184,7 +31184,7 @@
                 <w:szCs w:val="19"/>
                 <w:lang w:val="en-US"/>
               </w:rPr>
-              <w:t xml:space="preserve">DynamicMS links AI Use Cases to steps and shows the resolved prompt; the prompt is one text rather than separate fields, without per-field versions: Partial.</w:t>
+              <w:t xml:space="preserve">Each AI Use Case linked to one step; Prompt Specification with one field per aspect (role, context, task, inputs, knowledge, constraints, examples, format, tone, quality criteria, human checkpoint, model parameters), each with its own versions and restore, plus whole-specification versions; completeness required for activation; all use cases populated from their step; assembled prompt visible: Met.</w:t>
             </w:r>
           </w:p>
         </w:tc>
@@ -31270,7 +31270,7 @@
                 <w:szCs w:val="19"/>
                 <w:lang w:val="en-US"/>
               </w:rPr>
-              <w:t xml:space="preserve">Implemented in DynamicMS (September 2026 build): Met.</w:t>
+              <w:t xml:space="preserve">Implemented in DynamicMS (September 2026 build), with procedures carrying SIPOC per step, Go / No-Go decisions and BPMN diagrams: Met.</w:t>
             </w:r>
           </w:p>
         </w:tc>

</xml_diff>